<commit_message>
PR#32 bounded corrections: nested-aware licence attribution (53 pkgs; 51 from files, 2 reconstructed from SPDX), portable ci/yarn.lock + preserveSymlinks reproducible worker build, corrected integrity workflow (not auto-required; check name reported)
</commit_message>
<xml_diff>
--- a/docs/pr-32-description.docx
+++ b/docs/pr-32-description.docx
@@ -337,7 +337,7 @@
         <w:rPr>
           <w:rStyle w:val="VerbatimChar"/>
         </w:rPr>
-        <w:t xml:space="preserve">ac385816…</w:t>
+        <w:t xml:space="preserve">c39f2bc8…</w:t>
       </w:r>
       <w:r>
         <w:t xml:space="preserve">.</w:t>
@@ -484,13 +484,34 @@
         <w:rPr>
           <w:rStyle w:val="VerbatimChar"/>
         </w:rPr>
+        <w:t xml:space="preserve">ci/yarn.lock</w:t>
+      </w:r>
+      <w:r>
+        <w:t xml:space="preserve"> </w:t>
+      </w:r>
+      <w:r>
+        <w:t xml:space="preserve">— a portable, committed lockfile (a copy of the platform store’s fully-resolved lockfile, carrying no machine-specific paths) used by the CI verification route; it does not change the platform-managed store.</w:t>
+      </w:r>
+    </w:p>
+    <w:p>
+      <w:pPr>
+        <w:numPr>
+          <w:ilvl w:val="0"/>
+          <w:numId w:val="1001"/>
+        </w:numPr>
+        <w:pStyle w:val="Compact"/>
+      </w:pPr>
+      <w:r>
+        <w:rPr>
+          <w:rStyle w:val="VerbatimChar"/>
+        </w:rPr>
         <w:t xml:space="preserve">.github/workflows/parser-worker-integrity.yml</w:t>
       </w:r>
       <w:r>
         <w:t xml:space="preserve"> </w:t>
       </w:r>
       <w:r>
-        <w:t xml:space="preserve">— required CI gate running</w:t>
+        <w:t xml:space="preserve">— a CI workflow that runs</w:t>
       </w:r>
       <w:r>
         <w:t xml:space="preserve"> </w:t>
@@ -505,7 +526,19 @@
         <w:t xml:space="preserve"> </w:t>
       </w:r>
       <w:r>
-        <w:t xml:space="preserve">on a clean install.</w:t>
+        <w:t xml:space="preserve">from a fresh, immutable install using</w:t>
+      </w:r>
+      <w:r>
+        <w:t xml:space="preserve"> </w:t>
+      </w:r>
+      <w:r>
+        <w:rPr>
+          <w:rStyle w:val="VerbatimChar"/>
+        </w:rPr>
+        <w:t xml:space="preserve">ci/yarn.lock</w:t>
+      </w:r>
+      <w:r>
+        <w:t xml:space="preserve">. Adding this file does not by itself make the check required; a maintainer must enable it as a required status check in branch protection.</w:t>
       </w:r>
     </w:p>
     <w:bookmarkEnd w:id="21"/>
@@ -531,7 +564,7 @@
           <w:bCs/>
           <w:b/>
         </w:rPr>
-        <w:t xml:space="preserve">esbuild pinned.</w:t>
+        <w:t xml:space="preserve">esbuild pinned and a portable lockfile committed.</w:t>
       </w:r>
       <w:r>
         <w:t xml:space="preserve"> </w:t>
@@ -573,7 +606,7 @@
         <w:t xml:space="preserve">0.28.2</w:t>
       </w:r>
       <w:r>
-        <w:t xml:space="preserve">; it is now an explicit pinned dev dependency. (The repo</w:t>
+        <w:t xml:space="preserve">; it is now an explicit pinned dev dependency. The repo</w:t>
       </w:r>
       <w:r>
         <w:t xml:space="preserve"> </w:t>
@@ -588,7 +621,112 @@
         <w:t xml:space="preserve"> </w:t>
       </w:r>
       <w:r>
-        <w:t xml:space="preserve">is a git-tracked symlink into the platform store and cannot carry a project-local lock; the pin plus the manifest plus the CI clean-install gate provide reproducibility instead.)</w:t>
+        <w:t xml:space="preserve">is a git-tracked symlink into the platform store and cannot carry a project-local lock, so a portable copy of the fully-resolved lockfile is committed at</w:t>
+      </w:r>
+      <w:r>
+        <w:t xml:space="preserve"> </w:t>
+      </w:r>
+      <w:r>
+        <w:rPr>
+          <w:rStyle w:val="VerbatimChar"/>
+        </w:rPr>
+        <w:t xml:space="preserve">ci/yarn.lock</w:t>
+      </w:r>
+      <w:r>
+        <w:t xml:space="preserve"> </w:t>
+      </w:r>
+      <w:r>
+        <w:t xml:space="preserve">(no machine-specific paths; pins esbuild</w:t>
+      </w:r>
+      <w:r>
+        <w:t xml:space="preserve"> </w:t>
+      </w:r>
+      <w:r>
+        <w:rPr>
+          <w:rStyle w:val="VerbatimChar"/>
+        </w:rPr>
+        <w:t xml:space="preserve">0.28.2</w:t>
+      </w:r>
+      <w:r>
+        <w:t xml:space="preserve">,</w:t>
+      </w:r>
+      <w:r>
+        <w:t xml:space="preserve"> </w:t>
+      </w:r>
+      <w:r>
+        <w:rPr>
+          <w:rStyle w:val="VerbatimChar"/>
+        </w:rPr>
+        <w:t xml:space="preserve">pdfjs-dist</w:t>
+      </w:r>
+      <w:r>
+        <w:t xml:space="preserve"> </w:t>
+      </w:r>
+      <w:r>
+        <w:rPr>
+          <w:rStyle w:val="VerbatimChar"/>
+        </w:rPr>
+        <w:t xml:space="preserve">6.3.289</w:t>
+      </w:r>
+      <w:r>
+        <w:t xml:space="preserve">,</w:t>
+      </w:r>
+      <w:r>
+        <w:t xml:space="preserve"> </w:t>
+      </w:r>
+      <w:r>
+        <w:rPr>
+          <w:rStyle w:val="VerbatimChar"/>
+        </w:rPr>
+        <w:t xml:space="preserve">mammoth</w:t>
+      </w:r>
+      <w:r>
+        <w:t xml:space="preserve"> </w:t>
+      </w:r>
+      <w:r>
+        <w:rPr>
+          <w:rStyle w:val="VerbatimChar"/>
+        </w:rPr>
+        <w:t xml:space="preserve">1.12.2</w:t>
+      </w:r>
+      <w:r>
+        <w:t xml:space="preserve">,</w:t>
+      </w:r>
+      <w:r>
+        <w:t xml:space="preserve"> </w:t>
+      </w:r>
+      <w:r>
+        <w:rPr>
+          <w:rStyle w:val="VerbatimChar"/>
+        </w:rPr>
+        <w:t xml:space="preserve">mailparser</w:t>
+      </w:r>
+      <w:r>
+        <w:t xml:space="preserve"> </w:t>
+      </w:r>
+      <w:r>
+        <w:rPr>
+          <w:rStyle w:val="VerbatimChar"/>
+        </w:rPr>
+        <w:t xml:space="preserve">3.9.23</w:t>
+      </w:r>
+      <w:r>
+        <w:t xml:space="preserve"> </w:t>
+      </w:r>
+      <w:r>
+        <w:t xml:space="preserve">and the rest of the graph). The CI route installs from it with</w:t>
+      </w:r>
+      <w:r>
+        <w:t xml:space="preserve"> </w:t>
+      </w:r>
+      <w:r>
+        <w:rPr>
+          <w:rStyle w:val="VerbatimChar"/>
+        </w:rPr>
+        <w:t xml:space="preserve">yarn install --immutable</w:t>
+      </w:r>
+      <w:r>
+        <w:t xml:space="preserve">, so no new versions are silently resolved.</w:t>
       </w:r>
     </w:p>
     <w:p>
@@ -604,7 +742,7 @@
           <w:bCs/>
           <w:b/>
         </w:rPr>
-        <w:t xml:space="preserve">Integrity is a required gate.</w:t>
+        <w:t xml:space="preserve">Integrity check runs in CI (not automatically required).</w:t>
       </w:r>
       <w:r>
         <w:t xml:space="preserve"> </w:t>
@@ -619,7 +757,22 @@
         <w:t xml:space="preserve"> </w:t>
       </w:r>
       <w:r>
-        <w:t xml:space="preserve">runs in CI on PRs into</w:t>
+        <w:t xml:space="preserve">runs in the</w:t>
+      </w:r>
+      <w:r>
+        <w:t xml:space="preserve"> </w:t>
+      </w:r>
+      <w:r>
+        <w:rPr>
+          <w:rStyle w:val="VerbatimChar"/>
+        </w:rPr>
+        <w:t xml:space="preserve">parser-worker-integrity.yml</w:t>
+      </w:r>
+      <w:r>
+        <w:t xml:space="preserve"> </w:t>
+      </w:r>
+      <w:r>
+        <w:t xml:space="preserve">workflow on pull requests into</w:t>
       </w:r>
       <w:r>
         <w:t xml:space="preserve"> </w:t>
@@ -646,7 +799,67 @@
         <w:t xml:space="preserve">main</w:t>
       </w:r>
       <w:r>
-        <w:t xml:space="preserve">. It is intentionally NOT wired into</w:t>
+        <w:t xml:space="preserve"> </w:t>
+      </w:r>
+      <w:r>
+        <w:t xml:space="preserve">(and pushes to them). Adding the workflow does NOT make it a required check — a maintainer must add the check named</w:t>
+      </w:r>
+      <w:r>
+        <w:t xml:space="preserve"> </w:t>
+      </w:r>
+      <w:r>
+        <w:rPr>
+          <w:rStyle w:val="VerbatimChar"/>
+        </w:rPr>
+        <w:t xml:space="preserve">Parser worker integrity / check-worker</w:t>
+      </w:r>
+      <w:r>
+        <w:t xml:space="preserve"> </w:t>
+      </w:r>
+      <w:r>
+        <w:t xml:space="preserve">in Settings → Branches for it to block merges. The workflow has no</w:t>
+      </w:r>
+      <w:r>
+        <w:t xml:space="preserve"> </w:t>
+      </w:r>
+      <w:r>
+        <w:rPr>
+          <w:rStyle w:val="VerbatimChar"/>
+        </w:rPr>
+        <w:t xml:space="preserve">paths:</w:t>
+      </w:r>
+      <w:r>
+        <w:t xml:space="preserve"> </w:t>
+      </w:r>
+      <w:r>
+        <w:t xml:space="preserve">filter, so it always runs and is therefore compatible with being marked required. It replaces the platform lockfile symlink with the committed</w:t>
+      </w:r>
+      <w:r>
+        <w:t xml:space="preserve"> </w:t>
+      </w:r>
+      <w:r>
+        <w:rPr>
+          <w:rStyle w:val="VerbatimChar"/>
+        </w:rPr>
+        <w:t xml:space="preserve">ci/yarn.lock</w:t>
+      </w:r>
+      <w:r>
+        <w:t xml:space="preserve"> </w:t>
+      </w:r>
+      <w:r>
+        <w:t xml:space="preserve">and runs</w:t>
+      </w:r>
+      <w:r>
+        <w:t xml:space="preserve"> </w:t>
+      </w:r>
+      <w:r>
+        <w:rPr>
+          <w:rStyle w:val="VerbatimChar"/>
+        </w:rPr>
+        <w:t xml:space="preserve">yarn install --immutable</w:t>
+      </w:r>
+      <w:r>
+        <w:t xml:space="preserve">, so the fresh install cannot silently resolve new versions; a green run proves the bundle reproduces off-platform. It is intentionally NOT wired into</w:t>
       </w:r>
       <w:r>
         <w:t xml:space="preserve"> </w:t>
@@ -658,19 +871,7 @@
         <w:t xml:space="preserve">yarn run build</w:t>
       </w:r>
       <w:r>
-        <w:t xml:space="preserve">, so drift blocks merges without ever aborting a production deploy. The CI install deletes the platform lockfile symlink and installs cleanly from</w:t>
-      </w:r>
-      <w:r>
-        <w:t xml:space="preserve"> </w:t>
-      </w:r>
-      <w:r>
-        <w:rPr>
-          <w:rStyle w:val="VerbatimChar"/>
-        </w:rPr>
-        <w:t xml:space="preserve">package.json</w:t>
-      </w:r>
-      <w:r>
-        <w:t xml:space="preserve">, proving the bundle reproduces off-platform.</w:t>
+        <w:t xml:space="preserve">, so drift never aborts a production deploy.</w:t>
       </w:r>
     </w:p>
     <w:p>
@@ -686,7 +887,7 @@
           <w:bCs/>
           <w:b/>
         </w:rPr>
-        <w:t xml:space="preserve">Licence attribution completed.</w:t>
+        <w:t xml:space="preserve">Licence attribution corrected.</w:t>
       </w:r>
       <w:r>
         <w:t xml:space="preserve"> </w:t>
@@ -722,88 +923,196 @@
         <w:t xml:space="preserve"> </w:t>
       </w:r>
       <w:r>
-        <w:t xml:space="preserve">resolution (</w:t>
-      </w:r>
-      <w:r>
-        <w:rPr>
-          <w:rStyle w:val="VerbatimChar"/>
-        </w:rPr>
-        <w:t xml:space="preserve">deepmerge-ts</w:t>
-      </w:r>
-      <w:r>
-        <w:t xml:space="preserve">,</w:t>
-      </w:r>
-      <w:r>
-        <w:t xml:space="preserve"> </w:t>
-      </w:r>
-      <w:r>
-        <w:rPr>
-          <w:rStyle w:val="VerbatimChar"/>
-        </w:rPr>
-        <w:t xml:space="preserve">dom-serializer</w:t>
-      </w:r>
-      <w:r>
-        <w:t xml:space="preserve">,</w:t>
-      </w:r>
-      <w:r>
-        <w:t xml:space="preserve"> </w:t>
-      </w:r>
-      <w:r>
-        <w:rPr>
-          <w:rStyle w:val="VerbatimChar"/>
-        </w:rPr>
-        <w:t xml:space="preserve">domelementtype</w:t>
-      </w:r>
-      <w:r>
-        <w:t xml:space="preserve">,</w:t>
-      </w:r>
-      <w:r>
-        <w:t xml:space="preserve"> </w:t>
-      </w:r>
-      <w:r>
-        <w:rPr>
-          <w:rStyle w:val="VerbatimChar"/>
-        </w:rPr>
-        <w:t xml:space="preserve">domhandler</w:t>
-      </w:r>
-      <w:r>
-        <w:t xml:space="preserve">,</w:t>
-      </w:r>
-      <w:r>
-        <w:t xml:space="preserve"> </w:t>
-      </w:r>
-      <w:r>
-        <w:rPr>
-          <w:rStyle w:val="VerbatimChar"/>
-        </w:rPr>
-        <w:t xml:space="preserve">domutils</w:t>
-      </w:r>
-      <w:r>
-        <w:t xml:space="preserve">,</w:t>
-      </w:r>
-      <w:r>
-        <w:t xml:space="preserve"> </w:t>
-      </w:r>
-      <w:r>
-        <w:rPr>
-          <w:rStyle w:val="VerbatimChar"/>
-        </w:rPr>
-        <w:t xml:space="preserve">entities</w:t>
-      </w:r>
-      <w:r>
-        <w:t xml:space="preserve">,</w:t>
-      </w:r>
-      <w:r>
-        <w:t xml:space="preserve"> </w:t>
-      </w:r>
-      <w:r>
-        <w:rPr>
-          <w:rStyle w:val="VerbatimChar"/>
-        </w:rPr>
-        <w:t xml:space="preserve">htmlparser2</w:t>
-      </w:r>
-      <w:r>
-        <w:t xml:space="preserve">). It now resolves them robustly and throws if any inlined package is unattributed. Attribution now covers 49 packages (was 42);</w:t>
+        <w:t xml:space="preserve">resolution. It now resolves the actual package directory for every entry in esbuild’s input graph (including nested versions), inspects licence filenames case-insensitively, collects applicable</w:t>
+      </w:r>
+      <w:r>
+        <w:t xml:space="preserve"> </w:t>
+      </w:r>
+      <w:r>
+        <w:rPr>
+          <w:rStyle w:val="VerbatimChar"/>
+        </w:rPr>
+        <w:t xml:space="preserve">NOTICE</w:t>
+      </w:r>
+      <w:r>
+        <w:t xml:space="preserve"> </w:t>
+      </w:r>
+      <w:r>
+        <w:t xml:space="preserve">files, and throws if any inlined package cannot be attributed. Attribution now covers</w:t>
+      </w:r>
+      <w:r>
+        <w:t xml:space="preserve"> </w:t>
+      </w:r>
+      <w:r>
+        <w:rPr>
+          <w:bCs/>
+          <w:b/>
+        </w:rPr>
+        <w:t xml:space="preserve">53 inlined packages: 51 attributed from bundled licence/</w:t>
+      </w:r>
+      <w:r>
+        <w:rPr>
+          <w:rStyle w:val="VerbatimChar"/>
+          <w:bCs/>
+          <w:b/>
+        </w:rPr>
+        <w:t xml:space="preserve">NOTICE</w:t>
+      </w:r>
+      <w:r>
+        <w:rPr>
+          <w:bCs/>
+          <w:b/>
+        </w:rPr>
+        <w:t xml:space="preserve"> </w:t>
+      </w:r>
+      <w:r>
+        <w:rPr>
+          <w:bCs/>
+          <w:b/>
+        </w:rPr>
+        <w:t xml:space="preserve">files, and 2 reconstructed from a canonical SPDX template</w:t>
+      </w:r>
+      <w:r>
+        <w:t xml:space="preserve"> </w:t>
+      </w:r>
+      <w:r>
+        <w:t xml:space="preserve">—</w:t>
+      </w:r>
+      <w:r>
+        <w:t xml:space="preserve"> </w:t>
+      </w:r>
+      <w:r>
+        <w:rPr>
+          <w:rStyle w:val="VerbatimChar"/>
+        </w:rPr>
+        <w:t xml:space="preserve">dingbat-to-unicode@1.0.1</w:t>
+      </w:r>
+      <w:r>
+        <w:t xml:space="preserve"> </w:t>
+      </w:r>
+      <w:r>
+        <w:t xml:space="preserve">(BSD-2-Clause) and</w:t>
+      </w:r>
+      <w:r>
+        <w:t xml:space="preserve"> </w:t>
+      </w:r>
+      <w:r>
+        <w:rPr>
+          <w:rStyle w:val="VerbatimChar"/>
+        </w:rPr>
+        <w:t xml:space="preserve">isarray@1.0.0</w:t>
+      </w:r>
+      <w:r>
+        <w:t xml:space="preserve"> </w:t>
+      </w:r>
+      <w:r>
+        <w:t xml:space="preserve">(MIT) — because those two ship no standalone licence file. Both reconstructions are clearly labelled non-verbatim in</w:t>
+      </w:r>
+      <w:r>
+        <w:t xml:space="preserve"> </w:t>
+      </w:r>
+      <w:r>
+        <w:rPr>
+          <w:rStyle w:val="VerbatimChar"/>
+        </w:rPr>
+        <w:t xml:space="preserve">worker.LICENSES.txt</w:t>
+      </w:r>
+      <w:r>
+        <w:t xml:space="preserve">, and neither the file header nor the manifest claims complete verbatim attribution while they remain reconstructed.</w:t>
+      </w:r>
+    </w:p>
+    <w:p>
+      <w:pPr>
+        <w:numPr>
+          <w:ilvl w:val="0"/>
+          <w:numId w:val="1002"/>
+        </w:numPr>
+        <w:pStyle w:val="Compact"/>
+      </w:pPr>
+      <w:r>
+        <w:rPr>
+          <w:bCs/>
+          <w:b/>
+        </w:rPr>
+        <w:t xml:space="preserve">Worker bytes made reproducible off-platform.</w:t>
+      </w:r>
+      <w:r>
+        <w:t xml:space="preserve"> </w:t>
+      </w:r>
+      <w:r>
+        <w:t xml:space="preserve">esbuild follows the workspace</w:t>
+      </w:r>
+      <w:r>
+        <w:t xml:space="preserve"> </w:t>
+      </w:r>
+      <w:r>
+        <w:rPr>
+          <w:rStyle w:val="VerbatimChar"/>
+        </w:rPr>
+        <w:t xml:space="preserve">node_modules</w:t>
+      </w:r>
+      <w:r>
+        <w:t xml:space="preserve"> </w:t>
+      </w:r>
+      <w:r>
+        <w:t xml:space="preserve">symlink into the platform store and baked that absolute store path into the bundle’s module keys and</w:t>
+      </w:r>
+      <w:r>
+        <w:t xml:space="preserve"> </w:t>
+      </w:r>
+      <w:r>
+        <w:rPr>
+          <w:rStyle w:val="VerbatimChar"/>
+        </w:rPr>
+        <w:t xml:space="preserve">// path</w:t>
+      </w:r>
+      <w:r>
+        <w:t xml:space="preserve"> </w:t>
+      </w:r>
+      <w:r>
+        <w:t xml:space="preserve">comments, so a fresh install with real</w:t>
+      </w:r>
+      <w:r>
+        <w:t xml:space="preserve"> </w:t>
+      </w:r>
+      <w:r>
+        <w:rPr>
+          <w:rStyle w:val="VerbatimChar"/>
+        </w:rPr>
+        <w:t xml:space="preserve">node_modules</w:t>
+      </w:r>
+      <w:r>
+        <w:t xml:space="preserve"> </w:t>
+      </w:r>
+      <w:r>
+        <w:t xml:space="preserve">produced a non-byte-identical worker. The build now sets</w:t>
+      </w:r>
+      <w:r>
+        <w:t xml:space="preserve"> </w:t>
+      </w:r>
+      <w:r>
+        <w:rPr>
+          <w:rStyle w:val="VerbatimChar"/>
+        </w:rPr>
+        <w:t xml:space="preserve">preserveSymlinks: true</w:t>
+      </w:r>
+      <w:r>
+        <w:t xml:space="preserve">, emitting stable</w:t>
+      </w:r>
+      <w:r>
+        <w:t xml:space="preserve"> </w:t>
+      </w:r>
+      <w:r>
+        <w:rPr>
+          <w:rStyle w:val="VerbatimChar"/>
+        </w:rPr>
+        <w:t xml:space="preserve">node_modules/&lt;pkg&gt;/...</w:t>
+      </w:r>
+      <w:r>
+        <w:t xml:space="preserve"> </w:t>
+      </w:r>
+      <w:r>
+        <w:t xml:space="preserve">paths from both the platform (symlinked) build and a genuinely fresh install. This changed</w:t>
       </w:r>
       <w:r>
         <w:t xml:space="preserve"> </w:t>
@@ -818,7 +1127,37 @@
         <w:t xml:space="preserve"> </w:t>
       </w:r>
       <w:r>
-        <w:t xml:space="preserve">is byte-identical, confirming an attribution-only change.</w:t>
+        <w:t xml:space="preserve">from sha256</w:t>
+      </w:r>
+      <w:r>
+        <w:t xml:space="preserve"> </w:t>
+      </w:r>
+      <w:r>
+        <w:rPr>
+          <w:rStyle w:val="VerbatimChar"/>
+        </w:rPr>
+        <w:t xml:space="preserve">ac385816…</w:t>
+      </w:r>
+      <w:r>
+        <w:t xml:space="preserve"> </w:t>
+      </w:r>
+      <w:r>
+        <w:t xml:space="preserve">to</w:t>
+      </w:r>
+      <w:r>
+        <w:t xml:space="preserve"> </w:t>
+      </w:r>
+      <w:r>
+        <w:rPr>
+          <w:rStyle w:val="VerbatimChar"/>
+        </w:rPr>
+        <w:t xml:space="preserve">c39f2bc8…</w:t>
+      </w:r>
+      <w:r>
+        <w:t xml:space="preserve"> </w:t>
+      </w:r>
+      <w:r>
+        <w:t xml:space="preserve">— a path-normalisation change only, with no code or dependency change — and removes the leaked host path from the committed bundle.</w:t>
       </w:r>
     </w:p>
     <w:bookmarkEnd w:id="22"/>
@@ -883,6 +1222,84 @@
       </w:r>
       <w:r>
         <w:t xml:space="preserve">: green (byte-identical rebuild).</w:t>
+      </w:r>
+    </w:p>
+    <w:p>
+      <w:pPr>
+        <w:numPr>
+          <w:ilvl w:val="0"/>
+          <w:numId w:val="1003"/>
+        </w:numPr>
+        <w:pStyle w:val="Compact"/>
+      </w:pPr>
+      <w:r>
+        <w:t xml:space="preserve">Reproducibility: a genuinely fresh</w:t>
+      </w:r>
+      <w:r>
+        <w:t xml:space="preserve"> </w:t>
+      </w:r>
+      <w:r>
+        <w:rPr>
+          <w:rStyle w:val="VerbatimChar"/>
+        </w:rPr>
+        <w:t xml:space="preserve">yarn install --immutable</w:t>
+      </w:r>
+      <w:r>
+        <w:t xml:space="preserve"> </w:t>
+      </w:r>
+      <w:r>
+        <w:t xml:space="preserve">from</w:t>
+      </w:r>
+      <w:r>
+        <w:t xml:space="preserve"> </w:t>
+      </w:r>
+      <w:r>
+        <w:rPr>
+          <w:rStyle w:val="VerbatimChar"/>
+        </w:rPr>
+        <w:t xml:space="preserve">ci/yarn.lock</w:t>
+      </w:r>
+      <w:r>
+        <w:t xml:space="preserve"> </w:t>
+      </w:r>
+      <w:r>
+        <w:t xml:space="preserve">(real</w:t>
+      </w:r>
+      <w:r>
+        <w:t xml:space="preserve"> </w:t>
+      </w:r>
+      <w:r>
+        <w:rPr>
+          <w:rStyle w:val="VerbatimChar"/>
+        </w:rPr>
+        <w:t xml:space="preserve">node_modules</w:t>
+      </w:r>
+      <w:r>
+        <w:t xml:space="preserve">, isolated cache) left the lockfile unmutated and produced a byte-identical</w:t>
+      </w:r>
+      <w:r>
+        <w:t xml:space="preserve"> </w:t>
+      </w:r>
+      <w:r>
+        <w:rPr>
+          <w:rStyle w:val="VerbatimChar"/>
+        </w:rPr>
+        <w:t xml:space="preserve">worker.mjs</w:t>
+      </w:r>
+      <w:r>
+        <w:t xml:space="preserve"> </w:t>
+      </w:r>
+      <w:r>
+        <w:t xml:space="preserve">(</w:t>
+      </w:r>
+      <w:r>
+        <w:rPr>
+          <w:rStyle w:val="VerbatimChar"/>
+        </w:rPr>
+        <w:t xml:space="preserve">c39f2bc8…</w:t>
+      </w:r>
+      <w:r>
+        <w:t xml:space="preserve">), confirming off-platform reproducibility.</w:t>
       </w:r>
     </w:p>
     <w:p>

</xml_diff>